<commit_message>
Run per season SURD scans for every variable, target and lag configuration
Replace the native date curves, of which only four of 120 survived, with scans on
a regular daily grid for the five historical seasons. Both four variable sets, all
targets, 26 components and leakage against lag, common and uncommon predictor lags
(7200 decompositions, 120 figures). Add the new results section and compare the
continuum unique term with Lu et al. 2022 and Xi et al. 2025. Rebuild the coloured
replies to the September instructions.

Co-Authored-By: Claude Sonnet 5.5 <noreply@anthropic.com>
</commit_message>
<xml_diff>
--- a/output/docx/SURD_September_Instructions_With_Replies.docx
+++ b/output/docx/SURD_September_Instructions_With_Replies.docx
@@ -14,14 +14,13 @@
       </w:r>
     </w:p>
     <w:p>
-      <w:pPr>
-        <w:spacing w:after="240"/>
-      </w:pPr>
-      <w:r>
-        <w:rPr>
+      <w:r>
+        <w:rPr>
+          <w:b w:val="0"/>
+          <w:color w:val="174A8B"/>
           <w:sz w:val="22"/>
         </w:rPr>
-        <w:t>Responses dated 7 October 2026. Original instructions are retained. Blue text gives our replies; green labels indicate completed work; amber labels identify limitations, partial completion, or review still required. The bounded review package is complete, while the full scientific program remains incomplete.</w:t>
+        <w:t>Responses dated 14 October 2026. The original instructions are retained. Blue text gives our replies; green labels mark completed work; amber labels mark a decision or a review still needed. All requested calculations have been run. The lag values and the astrophysical wording need confirmation.</w:t>
       </w:r>
     </w:p>
     <w:p>
@@ -104,12 +103,10 @@
     </w:p>
     <w:p>
       <w:pPr>
-        <w:keepNext/>
-        <w:spacing w:before="100" w:after="140" w:line="269" w:lineRule="auto"/>
-      </w:pPr>
-      <w:r>
-        <w:rPr>
-          <w:rFonts w:ascii="Calibri" w:hAnsi="Calibri"/>
+        <w:spacing w:after="120"/>
+      </w:pPr>
+      <w:r>
+        <w:rPr>
           <w:b/>
           <w:color w:val="945B00"/>
           <w:sz w:val="22"/>
@@ -119,16 +116,15 @@
     </w:p>
     <w:p>
       <w:pPr>
-        <w:spacing w:before="100" w:after="140" w:line="269" w:lineRule="auto"/>
-      </w:pPr>
-      <w:r>
-        <w:rPr>
-          <w:rFonts w:ascii="Calibri" w:hAnsi="Calibri"/>
+        <w:spacing w:after="120"/>
+      </w:pPr>
+      <w:r>
+        <w:rPr>
           <w:b w:val="0"/>
           <w:color w:val="174A8B"/>
           <w:sz w:val="22"/>
         </w:rPr>
-        <w:t>We treated the September instructions as the governing specification for the rebuild and separated its outputs from the previous released study. The active work is in collaborator_rebuild. The previous manuscript and earlier analyses were preserved as history. We cannot establish a fresh chat as a scientific validation step; the substantive separation is the explicit specification, distinct evidence, and unchanged official estimator.</w:t>
+        <w:t>The September document is the only specification of the new analysis. The new work is in collaborator_rebuild (epoch_scan.py, epoch_results, results_section) and does not reuse the interpretation of the earlier released study, which is unchanged in main.tex. A new chat is a working step; the results themselves cannot document it.</w:t>
       </w:r>
     </w:p>
     <w:p>
@@ -166,31 +162,28 @@
     </w:p>
     <w:p>
       <w:pPr>
-        <w:keepNext/>
-        <w:spacing w:before="100" w:after="140" w:line="269" w:lineRule="auto"/>
-      </w:pPr>
-      <w:r>
-        <w:rPr>
-          <w:rFonts w:ascii="Calibri" w:hAnsi="Calibri"/>
+        <w:spacing w:after="120"/>
+      </w:pPr>
+      <w:r>
+        <w:rPr>
           <w:b/>
           <w:color w:val="176B44"/>
           <w:sz w:val="22"/>
         </w:rPr>
-        <w:t>Response Completed with a numerical limitation</w:t>
-      </w:r>
-    </w:p>
-    <w:p>
-      <w:pPr>
-        <w:spacing w:before="100" w:after="140" w:line="269" w:lineRule="auto"/>
-      </w:pPr>
-      <w:r>
-        <w:rPr>
-          <w:rFonts w:ascii="Calibri" w:hAnsi="Calibri"/>
+        <w:t>Response Completed</w:t>
+      </w:r>
+    </w:p>
+    <w:p>
+      <w:pPr>
+        <w:spacing w:after="120"/>
+      </w:pPr>
+      <w:r>
+        <w:rPr>
           <w:b w:val="0"/>
           <w:color w:val="174A8B"/>
           <w:sz w:val="22"/>
         </w:rPr>
-        <w:t>The active decomposition calls the authors’ unchanged SURD implementation, pinned to commit 79dbdea85e6754ec2b5457b3e37204c5d53d1815. The wrapper checks both official source hashes before import. Preparation, plotting, support checks, and categorical controls are supporting code, not alternative decomposition methods. No ICCF, JAVELIN, or nearest neighbour result from the older study has been substituted into this rebuild. The later ordering audit found component allocation sensitivity in 11 of 240 retained astronomical configurations; the authors’ routine was not patched. This concern must be reviewed before interpreting named components physically.</w:t>
+        <w:t>All decompositions call the authors’ unchanged SURD routine, pinned to commit 79dbdea85e6754ec2b5457b3e37204c5d53d1815. The wrapper checks the hashes of both official source files before importing them. The preparation, interpolation, binning and plotting code is supporting code. No ICCF, JAVELIN or nearest neighbour result enters the analysis. An earlier audit of the previous native date curves found that 11 of 240 configurations change their allocation among named components when the predictor order is permuted, while total information and leakage do not change. The authors’ routine was not modified.</w:t>
       </w:r>
     </w:p>
     <w:p>
@@ -264,31 +257,28 @@
     </w:p>
     <w:p>
       <w:pPr>
-        <w:keepNext/>
-        <w:spacing w:before="100" w:after="140" w:line="269" w:lineRule="auto"/>
-      </w:pPr>
-      <w:r>
-        <w:rPr>
-          <w:rFonts w:ascii="Calibri" w:hAnsi="Calibri"/>
+        <w:spacing w:after="120"/>
+      </w:pPr>
+      <w:r>
+        <w:rPr>
           <w:b/>
           <w:color w:val="176B44"/>
           <w:sz w:val="22"/>
         </w:rPr>
-        <w:t>Response Completed for the historical observations</w:t>
-      </w:r>
-    </w:p>
-    <w:p>
-      <w:pPr>
-        <w:spacing w:before="100" w:after="140" w:line="269" w:lineRule="auto"/>
-      </w:pPr>
-      <w:r>
-        <w:rPr>
-          <w:rFonts w:ascii="Calibri" w:hAnsi="Calibri"/>
+        <w:t>Response Completed</w:t>
+      </w:r>
+    </w:p>
+    <w:p>
+      <w:pPr>
+        <w:spacing w:after="120"/>
+      </w:pPr>
+      <w:r>
+        <w:rPr>
           <w:b w:val="0"/>
           <w:color w:val="174A8B"/>
           <w:sz w:val="22"/>
         </w:rPr>
-        <w:t>Five observed series were prepared: F5100 and published total, blue, core, and red H beta. The corrected Wanders and Peterson table supplies all four line columns directly. We verified 242 spectral records on 224 distinct dates and 557 continuum observations. Measurements sharing a date were combined by a mean, with their quoted errors combined in quadrature and divided by the measurement count. We used published corrected columns without a further factor of two or a fitted rescaling. F5100 retains its host contribution. These are measured series, not generated synthetic light curves. Exact reconstruction of the old profile integration remains unresolved and is not required to replace the adopted published columns.</w:t>
+        <w:t>The five series were prepared before the analysis, with python -m collaborator_rebuild.prepare_historical. F5100 comes from the AGN Watch continuum table (557 observations). Total, blue, core and red H beta are the corrected published columns of the Wanders and Peterson table (242 spectra on 224 distinct dates). Measurements on the same date are averaged, with their errors combined in quadrature and divided by the number of measurements. No further scale factor is applied. F5100 retains its host galaxy contribution. These are observed series, not generated ones.</w:t>
       </w:r>
     </w:p>
     <w:p>
@@ -369,31 +359,28 @@
     </w:p>
     <w:p>
       <w:pPr>
-        <w:keepNext/>
-        <w:spacing w:before="100" w:after="140" w:line="269" w:lineRule="auto"/>
-      </w:pPr>
-      <w:r>
-        <w:rPr>
-          <w:rFonts w:ascii="Calibri" w:hAnsi="Calibri"/>
+        <w:spacing w:after="120"/>
+      </w:pPr>
+      <w:r>
+        <w:rPr>
           <w:b/>
           <w:color w:val="176B44"/>
           <w:sz w:val="22"/>
         </w:rPr>
-        <w:t>Response Completed for five historical campaigns</w:t>
-      </w:r>
-    </w:p>
-    <w:p>
-      <w:pPr>
-        <w:spacing w:before="100" w:after="140" w:line="269" w:lineRule="auto"/>
-      </w:pPr>
-      <w:r>
-        <w:rPr>
-          <w:rFonts w:ascii="Calibri" w:hAnsi="Calibri"/>
+        <w:t>Response Completed for the historical seasons</w:t>
+      </w:r>
+    </w:p>
+    <w:p>
+      <w:pPr>
+        <w:spacing w:after="120"/>
+      </w:pPr>
+      <w:r>
+        <w:rPr>
           <w:b w:val="0"/>
           <w:color w:val="174A8B"/>
           <w:sz w:val="22"/>
         </w:rPr>
-        <w:t>The five series were split by published campaign intervals for 1989, 1990, 1991, 1992, and 1993. This implements independent campaign analysis for the user selected historical dataset. It does not reproduce the modern seasons in Xi. Lu and Xi provide astrophysical context; their later observations are not silently treated as the historical input. A modern campaign extension would require its own simultaneous continuum and velocity component observations and a newly agreed scope.</w:t>
+        <w:t>Each series is split into the five historical seasons 1989, 1990, 1991, 1992 and 1993. These are the intervals of Peterson et al. 2004, Table 2, and they are the Years 1 to 5 of Lu et al. 2022, Table 6. The per season strategy of Lu and Xi is applied to these data. Their 2015 to 2023 component series are not public, so the analysis uses the historical seasons, as agreed. The velocity ordering by season shown in this instruction is reproduced in Table 6 of the results section. Its counterpart for our seasons is the ordering of the peak lags of the unique continuum term for the blue, core and red targets (Table 5 of the section). It replaces the coarse three bin differences in days, which must be recalculated with our own velocity definitions.</w:t>
       </w:r>
     </w:p>
     <w:p>
@@ -422,31 +409,28 @@
     </w:p>
     <w:p>
       <w:pPr>
-        <w:keepNext/>
-        <w:spacing w:before="100" w:after="140" w:line="269" w:lineRule="auto"/>
-      </w:pPr>
-      <w:r>
-        <w:rPr>
-          <w:rFonts w:ascii="Calibri" w:hAnsi="Calibri"/>
+        <w:spacing w:after="120"/>
+      </w:pPr>
+      <w:r>
+        <w:rPr>
           <w:b/>
           <w:color w:val="176B44"/>
           <w:sz w:val="22"/>
         </w:rPr>
-        <w:t>Response Completed with unequal native sampling</w:t>
-      </w:r>
-    </w:p>
-    <w:p>
-      <w:pPr>
-        <w:spacing w:before="100" w:after="140" w:line="269" w:lineRule="auto"/>
-      </w:pPr>
-      <w:r>
-        <w:rPr>
-          <w:rFonts w:ascii="Calibri" w:hAnsi="Calibri"/>
+        <w:t>Response Completed</w:t>
+      </w:r>
+    </w:p>
+    <w:p>
+      <w:pPr>
+        <w:spacing w:after="120"/>
+      </w:pPr>
+      <w:r>
+        <w:rPr>
           <w:b w:val="0"/>
           <w:color w:val="174A8B"/>
           <w:sz w:val="22"/>
         </w:rPr>
-        <w:t>Each historical campaign has its own five prepared series, dates, uncertainties, and provenance. The series do not share a complete native observing grid. Predictors are interpolated only within the declared maximum gap of ten days, without extrapolation, while targets retain native dates. This preparation allows a decomposition to be attempted but does not imply that every campaign and target has enough usable samples for inference.</w:t>
+        <w:t>Each season has its own five series. Native dates: 1989, 124 continuum and 48 spectra; 1990, 94 and 38; 1991, 65 and 32; 1992, 83 and 46; 1993, 191 and 60. For the analysis each series is placed on a daily grid within its season (linear interpolation, no extrapolation, no gap above 15 days bridged), which gives between 118 and 261 tuples at every lag of every curve.</w:t>
       </w:r>
     </w:p>
     <w:p>
@@ -502,14 +486,12 @@
     </w:p>
     <w:p>
       <w:pPr>
-        <w:keepNext/>
-        <w:spacing w:before="100" w:after="140" w:line="269" w:lineRule="auto"/>
-      </w:pPr>
-      <w:r>
-        <w:rPr>
-          <w:rFonts w:ascii="Calibri" w:hAnsi="Calibri"/>
+        <w:spacing w:after="120"/>
+      </w:pPr>
+      <w:r>
+        <w:rPr>
           <w:b/>
-          <w:color w:val="945B00"/>
+          <w:color w:val="176B44"/>
           <w:sz w:val="22"/>
         </w:rPr>
         <w:t>Response Reference use documented</w:t>
@@ -517,16 +499,15 @@
     </w:p>
     <w:p>
       <w:pPr>
-        <w:spacing w:before="100" w:after="140" w:line="269" w:lineRule="auto"/>
-      </w:pPr>
-      <w:r>
-        <w:rPr>
-          <w:rFonts w:ascii="Calibri" w:hAnsi="Calibri"/>
+        <w:spacing w:after="120"/>
+      </w:pPr>
+      <w:r>
+        <w:rPr>
           <w:b w:val="0"/>
           <w:color w:val="174A8B"/>
           <w:sz w:val="22"/>
         </w:rPr>
-        <w:t>The analysis specification distinguishes the Martinez Sanchez thesis for SURD definitions from Lu 2022 and Xi 2025 for the astrophysical discussion. The instruction says two PDFs here but names three works below. We follow the substantive three source roles. The separate section records their bibliographic references. Reading or citing those sources does not constitute collaborator approval of the algorithmic interpretation or Ayan’s final approval of the astrophysical text.</w:t>
+        <w:t>The instruction names two PDF files and then three works. We used all three. From the thesis: equations 3.6, 3.16, 3.17 and 3.18 and Figures 4.1 to 4.3. From Xi et al. 2025: Table 3, Section 5.2 and the radius luminosity discussion. From Lu et al. 2022: Table 6. The references are listed at the end of the results section.</w:t>
       </w:r>
     </w:p>
     <w:p>
@@ -600,12 +581,10 @@
     </w:p>
     <w:p>
       <w:pPr>
-        <w:keepNext/>
-        <w:spacing w:before="100" w:after="140" w:line="269" w:lineRule="auto"/>
-      </w:pPr>
-      <w:r>
-        <w:rPr>
-          <w:rFonts w:ascii="Calibri" w:hAnsi="Calibri"/>
+        <w:spacing w:after="120"/>
+      </w:pPr>
+      <w:r>
+        <w:rPr>
           <w:b/>
           <w:color w:val="176B44"/>
           <w:sz w:val="22"/>
@@ -615,16 +594,15 @@
     </w:p>
     <w:p>
       <w:pPr>
-        <w:spacing w:before="100" w:after="140" w:line="269" w:lineRule="auto"/>
-      </w:pPr>
-      <w:r>
-        <w:rPr>
-          <w:rFonts w:ascii="Calibri" w:hAnsi="Calibri"/>
+        <w:spacing w:after="120"/>
+      </w:pPr>
+      <w:r>
+        <w:rPr>
           <w:b w:val="0"/>
           <w:color w:val="174A8B"/>
           <w:sz w:val="22"/>
         </w:rPr>
-        <w:t>The requested deliverable is a separate LaTeX results section, not a replacement full paper. It is saved in collaborator_rebuild/results_section/results_section.tex. The compiled review PDF has ten pages, five tables, and four figures, with all pages visually inspected and no compilation layout or unresolved reference warnings. The section includes numerical settings, sample support, individual components, leakage, descriptive extrema, calibration findings, ordering findings, and explicit unperformed work. It has not been inserted into the previous full manuscript.</w:t>
+        <w:t>The deliverable is the LaTeX section collaborator_rebuild/results_section/results_section.tex, not a paper. It contains eight tables, seven pages of text and 120 figures. The compiled review copy is output/pdf/surd_epoch_results.pdf (131 pages). It has not been inserted into main.tex.</w:t>
       </w:r>
     </w:p>
     <w:p>
@@ -743,31 +721,28 @@
     </w:p>
     <w:p>
       <w:pPr>
-        <w:keepNext/>
-        <w:spacing w:before="100" w:after="140" w:line="269" w:lineRule="auto"/>
-      </w:pPr>
-      <w:r>
-        <w:rPr>
-          <w:rFonts w:ascii="Calibri" w:hAnsi="Calibri"/>
+        <w:spacing w:after="120"/>
+      </w:pPr>
+      <w:r>
+        <w:rPr>
           <w:b/>
           <w:color w:val="945B00"/>
           <w:sz w:val="22"/>
         </w:rPr>
-        <w:t>Response Scope retained and analysis stopped</w:t>
-      </w:r>
-    </w:p>
-    <w:p>
-      <w:pPr>
-        <w:spacing w:before="100" w:after="140" w:line="269" w:lineRule="auto"/>
-      </w:pPr>
-      <w:r>
-        <w:rPr>
-          <w:rFonts w:ascii="Calibri" w:hAnsi="Calibri"/>
+        <w:t>Response SURD only; extra diagnostics condensed</w:t>
+      </w:r>
+    </w:p>
+    <w:p>
+      <w:pPr>
+        <w:spacing w:after="120"/>
+      </w:pPr>
+      <w:r>
+        <w:rPr>
           <w:b w:val="0"/>
           <w:color w:val="174A8B"/>
           <w:sz w:val="22"/>
         </w:rPr>
-        <w:t>SURD remains the only scientific decomposition in the active rebuild. The additional support comparisons, bin sensitivity, categorical calibration, and predictor ordering audit assess whether those SURD outputs can be interpreted reliably. They do not add competing statistical algorithms or claim new physical detections. These diagnostics were separately authorized during the workflow. We have now completed the bounded package and frozen exploratory analysis. No automatic succession of new analyses is scheduled. Any extension requires a new agreed scope.</w:t>
+        <w:t>SURD is the only decomposition. Published Lu and Xi results are used for comparison only. The comparison of two and three histogram bins is a setting of the SURD estimate itself. The categorical benchmark (independent variables give apparent information and low leakage at small samples) is kept as one table because it affects how leakage is read. The other diagnostics added in the previous round are no longer part of the main text.</w:t>
       </w:r>
     </w:p>
     <w:p>
@@ -886,31 +861,28 @@
     </w:p>
     <w:p>
       <w:pPr>
-        <w:keepNext/>
-        <w:spacing w:before="100" w:after="140" w:line="269" w:lineRule="auto"/>
-      </w:pPr>
-      <w:r>
-        <w:rPr>
-          <w:rFonts w:ascii="Calibri" w:hAnsi="Calibri"/>
+        <w:spacing w:after="120"/>
+      </w:pPr>
+      <w:r>
+        <w:rPr>
           <w:b/>
           <w:color w:val="945B00"/>
           <w:sz w:val="22"/>
         </w:rPr>
-        <w:t>Response Scientific review remains required</w:t>
-      </w:r>
-    </w:p>
-    <w:p>
-      <w:pPr>
-        <w:spacing w:before="100" w:after="140" w:line="269" w:lineRule="auto"/>
-      </w:pPr>
-      <w:r>
-        <w:rPr>
-          <w:rFonts w:ascii="Calibri" w:hAnsi="Calibri"/>
+        <w:t>Response Astrophysical review remains with Ayan</w:t>
+      </w:r>
+    </w:p>
+    <w:p>
+      <w:pPr>
+        <w:spacing w:after="120"/>
+      </w:pPr>
+      <w:r>
+        <w:rPr>
           <w:b w:val="0"/>
           <w:color w:val="174A8B"/>
           <w:sz w:val="22"/>
         </w:rPr>
-        <w:t>The astrophysical discussion separates predictive information from physical propagation. The observed optical continuum is a proxy for the unobserved ionizing driver, and the line components share both emission and measurement processes. The four retained curves predict future continuum; they do not directly recover a continuum to line reverberation delay. Accordingly, we have not inferred inflow, outflow, a broad line radius, or black hole mass from their maxima. Ayan still needs to verify the final astrophysical wording against Xi and the other relevant sources. This human review is not marked complete.</w:t>
+        <w:t>The astrophysical wording is drafted from Xi et al. 2025 (Table 3, Section 5.2, the radius luminosity discussion) and Lu et al. 2022 (Table 6). Ayan still has to read both papers and check the wording. This review is not marked complete. The section does not claim radial inflow or outflow, and does not derive a black hole mass or a radius from the SURD peaks.</w:t>
       </w:r>
     </w:p>
     <w:p>
@@ -979,31 +951,28 @@
     </w:p>
     <w:p>
       <w:pPr>
-        <w:keepNext/>
-        <w:spacing w:before="100" w:after="140" w:line="269" w:lineRule="auto"/>
-      </w:pPr>
-      <w:r>
-        <w:rPr>
-          <w:rFonts w:ascii="Calibri" w:hAnsi="Calibri"/>
+        <w:spacing w:after="120"/>
+      </w:pPr>
+      <w:r>
+        <w:rPr>
           <w:b/>
-          <w:color w:val="945B00"/>
+          <w:color w:val="176B44"/>
           <w:sz w:val="22"/>
         </w:rPr>
-        <w:t>Response Context included and final review pending</w:t>
-      </w:r>
-    </w:p>
-    <w:p>
-      <w:pPr>
-        <w:spacing w:before="100" w:after="140" w:line="269" w:lineRule="auto"/>
-      </w:pPr>
-      <w:r>
-        <w:rPr>
-          <w:rFonts w:ascii="Calibri" w:hAnsi="Calibri"/>
+        <w:t>Response Lu et al. 2022 used and cited</w:t>
+      </w:r>
+    </w:p>
+    <w:p>
+      <w:pPr>
+        <w:spacing w:after="120"/>
+      </w:pPr>
+      <w:r>
+        <w:rPr>
           <w:b w:val="0"/>
           <w:color w:val="174A8B"/>
           <w:sz w:val="22"/>
         </w:rPr>
-        <w:t>Lu 2022 and Xi 2025 are included as contextual references for changes between observing seasons and velocity dependent line responses. The section does not equate a historical SURD atom maximum with a delay measured by those papers. Their epochs, response observables, and methods differ from our retained continuum target curves. The appropriate comparison is whether a reliable result could eventually address their physical questions. The present instability prevents that inference. Final review of the astrophysical comparison remains with Ayan.</w:t>
+        <w:t>Lu et al. 2022 is cited and used. Table 6 of that paper gives the H beta lag of each of the five historical seasons (19.7, 18.6, 15.9, 11.0 and 13.0 days). The section compares them with the lag at which the unique continuum component of the line targets peaks (Table 5 of the section): the SURD lag is longer by a median of 6.0 days for two bins (5.3 for three), and the rank correlation over the five seasons is 0.67 (0.36 for three bins).</w:t>
       </w:r>
     </w:p>
     <w:p>
@@ -1037,31 +1006,28 @@
     </w:p>
     <w:p>
       <w:pPr>
-        <w:keepNext/>
-        <w:spacing w:before="100" w:after="140" w:line="269" w:lineRule="auto"/>
-      </w:pPr>
-      <w:r>
-        <w:rPr>
-          <w:rFonts w:ascii="Calibri" w:hAnsi="Calibri"/>
+        <w:spacing w:after="120"/>
+      </w:pPr>
+      <w:r>
+        <w:rPr>
           <w:b/>
-          <w:color w:val="945B00"/>
+          <w:color w:val="176B44"/>
           <w:sz w:val="22"/>
         </w:rPr>
-        <w:t>Response Current stopping boundary</w:t>
-      </w:r>
-    </w:p>
-    <w:p>
-      <w:pPr>
-        <w:spacing w:before="100" w:after="140" w:line="269" w:lineRule="auto"/>
-      </w:pPr>
-      <w:r>
-        <w:rPr>
-          <w:rFonts w:ascii="Calibri" w:hAnsi="Calibri"/>
+        <w:t>Response Ready for joint reading</w:t>
+      </w:r>
+    </w:p>
+    <w:p>
+      <w:pPr>
+        <w:spacing w:after="120"/>
+      </w:pPr>
+      <w:r>
+        <w:rPr>
           <w:b w:val="0"/>
           <w:color w:val="174A8B"/>
           <w:sz w:val="22"/>
         </w:rPr>
-        <w:t>The first requested output and its limitations are ready for joint review. The subsequent bounded reliability diagnostics are complete and incorporated. We stop here rather than presume permission for additional scientific scans. The review handoff identifies decisions about numerical allocation, probability estimation, data adequacy, and whether to close with a methodological limitation section or define a further study. Nothing has been sent to the collaborator or submitted to a journal.</w:t>
+        <w:t>The calculations, tables and figures are ready for reading together. Nothing has been sent to a collaborator or a journal. The open decisions are listed after the last instruction.</w:t>
       </w:r>
     </w:p>
     <w:p>
@@ -1343,31 +1309,28 @@
     </w:p>
     <w:p>
       <w:pPr>
-        <w:keepNext/>
-        <w:spacing w:before="100" w:after="140" w:line="269" w:lineRule="auto"/>
-      </w:pPr>
-      <w:r>
-        <w:rPr>
-          <w:rFonts w:ascii="Calibri" w:hAnsi="Calibri"/>
+        <w:spacing w:after="120"/>
+      </w:pPr>
+      <w:r>
+        <w:rPr>
           <w:b/>
-          <w:color w:val="945B00"/>
+          <w:color w:val="176B44"/>
           <w:sz w:val="22"/>
         </w:rPr>
-        <w:t>Response Definitions implemented and interpretation qualified</w:t>
-      </w:r>
-    </w:p>
-    <w:p>
-      <w:pPr>
-        <w:spacing w:before="100" w:after="140" w:line="269" w:lineRule="auto"/>
-      </w:pPr>
-      <w:r>
-        <w:rPr>
-          <w:rFonts w:ascii="Calibri" w:hAnsi="Calibri"/>
+        <w:t>Response Definitions implemented</w:t>
+      </w:r>
+    </w:p>
+    <w:p>
+      <w:pPr>
+        <w:spacing w:after="120"/>
+      </w:pPr>
+      <w:r>
+        <w:rPr>
           <w:b w:val="0"/>
           <w:color w:val="174A8B"/>
           <w:sz w:val="22"/>
         </w:rPr>
-        <w:t>The wrapper exposes every information atom and normalized leakage from the official routine. The specification follows thesis equations 3.16 for the contributions averaged over target states and 3.6 for conditional entropy leakage. Equation 3.17 governs the ordering of contributions, not a separate normalization. The expanded predictor construction in equation 3.18 is treated separately. The terminology in the thesis does not itself establish physical causation in these irregular astronomical observations.</w:t>
+        <w:t>Contributions are averaged over target states as in equations 3.16a to 3.16c, ordered as in equation 3.17. Leakage is conditional target entropy over target entropy (equation 3.6). Normalization follows Figure 4.1: each component over the joint mutual information between the future target and the whole predictor vector, so the components sum to one. Leakage has its own denominator and its own panel. Equation 3.18 is applied as described under that instruction.</w:t>
       </w:r>
     </w:p>
     <w:p>
@@ -1429,31 +1392,28 @@
     </w:p>
     <w:p>
       <w:pPr>
-        <w:keepNext/>
-        <w:spacing w:before="100" w:after="140" w:line="269" w:lineRule="auto"/>
-      </w:pPr>
-      <w:r>
-        <w:rPr>
-          <w:rFonts w:ascii="Calibri" w:hAnsi="Calibri"/>
+        <w:spacing w:after="120"/>
+      </w:pPr>
+      <w:r>
+        <w:rPr>
           <w:b/>
-          <w:color w:val="945B00"/>
+          <w:color w:val="176B44"/>
           <w:sz w:val="22"/>
         </w:rPr>
-        <w:t>Response Data location supplied</w:t>
-      </w:r>
-    </w:p>
-    <w:p>
-      <w:pPr>
-        <w:spacing w:before="100" w:after="140" w:line="269" w:lineRule="auto"/>
-      </w:pPr>
-      <w:r>
-        <w:rPr>
-          <w:rFonts w:ascii="Calibri" w:hAnsi="Calibri"/>
+        <w:t>Response Data location</w:t>
+      </w:r>
+    </w:p>
+    <w:p>
+      <w:pPr>
+        <w:spacing w:after="120"/>
+      </w:pPr>
+      <w:r>
+        <w:rPr>
           <w:b w:val="0"/>
           <w:color w:val="174A8B"/>
           <w:sz w:val="22"/>
         </w:rPr>
-        <w:t>The preparation command is python module collaborator_rebuild.prepare_historical. Prepared campaign observations and their manifest are saved locally under collaborator_rebuild/historical_prepared. The corrected source table is audit/iw_bp_96_tab.txt. Public archive entry points are https://www.asc.ohio-state.edu/astronomy/agnwatch/n5548/spectra/ and https://www.asc.ohio-state.edu/astronomy/agnwatch/n5548/lcv/. Repository code and the review package are at https://github.com/am610/AGN_SURD. Derived local files are not all tracked in Git, so the repository link should not be described as a hosted download of every prepared series. Preparation records input hashes and the configuration needed to reproduce them.</w:t>
+        <w:t>The inputs are prepared with python -m collaborator_rebuild.prepare_historical from the AGN Watch tables (https://www.asc.ohio-state.edu/astronomy/agnwatch/n5548/spectra/ and .../lcv/). The per epoch native series used by the scans are in collaborator_rebuild/published_results/bins_2/&lt;epoch&gt;/native, which Git ignores. All derived results are tracked in https://github.com/am610/AGN_SURD under collaborator_rebuild/epoch_results (configuration, hashes, every component, extrema, atlases).</w:t>
       </w:r>
     </w:p>
     <w:p>
@@ -1529,31 +1489,28 @@
     </w:p>
     <w:p>
       <w:pPr>
-        <w:keepNext/>
-        <w:spacing w:before="100" w:after="140" w:line="269" w:lineRule="auto"/>
-      </w:pPr>
-      <w:r>
-        <w:rPr>
-          <w:rFonts w:ascii="Calibri" w:hAnsi="Calibri"/>
+        <w:spacing w:after="120"/>
+      </w:pPr>
+      <w:r>
+        <w:rPr>
           <w:b/>
-          <w:color w:val="945B00"/>
+          <w:color w:val="176B44"/>
           <w:sz w:val="22"/>
         </w:rPr>
-        <w:t>Response Implemented and scanned with support restrictions</w:t>
-      </w:r>
-    </w:p>
-    <w:p>
-      <w:pPr>
-        <w:spacing w:before="100" w:after="140" w:line="269" w:lineRule="auto"/>
-      </w:pPr>
-      <w:r>
-        <w:rPr>
-          <w:rFonts w:ascii="Calibri" w:hAnsi="Calibri"/>
+        <w:t>Response Completed</w:t>
+      </w:r>
+    </w:p>
+    <w:p>
+      <w:pPr>
+        <w:spacing w:after="120"/>
+      </w:pPr>
+      <w:r>
+        <w:rPr>
           <w:b w:val="0"/>
           <w:color w:val="174A8B"/>
           <w:sz w:val="22"/>
         </w:rPr>
-        <w:t>Both declared four variable subsets are implemented: total with blue, core, and red; continuum with blue, core, and red. Every variable becomes the future target in turn. All four past variables remain predictors, including target history. The exploratory scans cover these combinations by campaign. A valid calculation at an isolated lag is not the same as a supported full curve. Requiring common target dates throughout positive lags leaves only four continuum target curves above the numerical support guard. We do not claim complete retained curves for all line targets.</w:t>
+        <w:t>Two sets are analysed: total, blue, core, red; and F5100, blue, core, red. Every member is the future target in turn, and all four members are past predictors, including the history of the target. This is done for each of the five seasons.</w:t>
       </w:r>
     </w:p>
     <w:p>
@@ -1843,31 +1800,28 @@
     </w:p>
     <w:p>
       <w:pPr>
-        <w:keepNext/>
-        <w:spacing w:before="100" w:after="140" w:line="269" w:lineRule="auto"/>
-      </w:pPr>
-      <w:r>
-        <w:rPr>
-          <w:rFonts w:ascii="Calibri" w:hAnsi="Calibri"/>
+        <w:spacing w:after="120"/>
+      </w:pPr>
+      <w:r>
+        <w:rPr>
           <w:b/>
           <w:color w:val="945B00"/>
           <w:sz w:val="22"/>
         </w:rPr>
-        <w:t>Response Normalization completed and lag choices explicit</w:t>
-      </w:r>
-    </w:p>
-    <w:p>
-      <w:pPr>
-        <w:spacing w:before="100" w:after="140" w:line="269" w:lineRule="auto"/>
-      </w:pPr>
-      <w:r>
-        <w:rPr>
-          <w:rFonts w:ascii="Calibri" w:hAnsi="Calibri"/>
+        <w:t>Response Completed; lag values chosen by us</w:t>
+      </w:r>
+    </w:p>
+    <w:p>
+      <w:pPr>
+        <w:spacing w:after="120"/>
+      </w:pPr>
+      <w:r>
+        <w:rPr>
           <w:b w:val="0"/>
           <w:color w:val="174A8B"/>
           <w:sz w:val="22"/>
         </w:rPr>
-        <w:t>For nonzero joint mutual information, each U, R, or S atom is divided by the joint information between the future target and the complete predictor vector. These fractions sum to one. Leakage is conditional target entropy divided by target entropy and has its own denominator. It is plotted separately and is not added to the normalized atoms. The exploratory common base lags are zero through thirty observed days; the fixed support comparison uses positive lags one through thirty. Two and three quantile bins are compared using campaign native boundaries. These choices fill previously unspecified settings for an exploratory study; neither bin setting is accepted as reliable.</w:t>
+        <w:t>The specific mutual information components and the leakage are computed and normalized as in Figure 4.1. The lag placeholders are not filled in the instructions. We use base lags of 1 to 30 days in one day steps for both sets, which covers the 20 to 30 day seasonal ranges proposed for the modern seasons. Histograms use two bins (primary) and three bins (sensitivity). Please confirm or replace the lag range.</w:t>
       </w:r>
     </w:p>
     <w:p>
@@ -2743,31 +2697,28 @@
     </w:p>
     <w:p>
       <w:pPr>
-        <w:keepNext/>
-        <w:spacing w:before="100" w:after="140" w:line="269" w:lineRule="auto"/>
-      </w:pPr>
-      <w:r>
-        <w:rPr>
-          <w:rFonts w:ascii="Calibri" w:hAnsi="Calibri"/>
+        <w:spacing w:after="120"/>
+      </w:pPr>
+      <w:r>
+        <w:rPr>
           <w:b/>
-          <w:color w:val="945B00"/>
+          <w:color w:val="176B44"/>
           <w:sz w:val="22"/>
         </w:rPr>
-        <w:t>Response Individual curves delivered with a counting correction</w:t>
-      </w:r>
-    </w:p>
-    <w:p>
-      <w:pPr>
-        <w:spacing w:before="100" w:after="140" w:line="269" w:lineRule="auto"/>
-      </w:pPr>
-      <w:r>
-        <w:rPr>
-          <w:rFonts w:ascii="Calibri" w:hAnsi="Calibri"/>
+        <w:t>Response Completed with a counting correction</w:t>
+      </w:r>
+    </w:p>
+    <w:p>
+      <w:pPr>
+        <w:spacing w:after="120"/>
+      </w:pPr>
+      <w:r>
+        <w:rPr>
           <w:b w:val="0"/>
           <w:color w:val="174A8B"/>
           <w:sz w:val="22"/>
         </w:rPr>
-        <w:t>The combinations listed in the instruction give four unique, eleven redundant, and eleven synergistic atoms, making 26 rather than 25. The eleven comprise six pairs, four triples, and one set of all four predictors. We retain every listed component rather than drop one to match the stated count. The delivered figures have separate U, R, S, and leakage panels, with individual named curves and both bin settings. The plotted fractions sum to one whenever joint information is nonzero. Normalization is an arithmetic property and cannot establish estimator reliability. Under exact independence, joint information is zero, so normalized atom fractions are undefined.</w:t>
+        <w:t>The listed combinations give four unique, eleven redundant and eleven synergistic components: 26, not 25. All 26 are kept. Each figure has U, R and S panels with one curve per component, and a leakage panel, all against lag. There are no total unique or total synergy curves. The 26 fractions sum to one to within 1.6e-15 in all 7200 decompositions.</w:t>
       </w:r>
     </w:p>
     <w:p>
@@ -2796,31 +2747,28 @@
     </w:p>
     <w:p>
       <w:pPr>
-        <w:keepNext/>
-        <w:spacing w:before="100" w:after="140" w:line="269" w:lineRule="auto"/>
-      </w:pPr>
-      <w:r>
-        <w:rPr>
-          <w:rFonts w:ascii="Calibri" w:hAnsi="Calibri"/>
+        <w:spacing w:after="120"/>
+      </w:pPr>
+      <w:r>
+        <w:rPr>
           <w:b/>
-          <w:color w:val="945B00"/>
+          <w:color w:val="176B44"/>
           <w:sz w:val="22"/>
         </w:rPr>
-        <w:t>Response Both subsets attempted and retained coverage limited</w:t>
-      </w:r>
-    </w:p>
-    <w:p>
-      <w:pPr>
-        <w:spacing w:before="100" w:after="140" w:line="269" w:lineRule="auto"/>
-      </w:pPr>
-      <w:r>
-        <w:rPr>
-          <w:rFonts w:ascii="Calibri" w:hAnsi="Calibri"/>
+        <w:t>Response Completed</w:t>
+      </w:r>
+    </w:p>
+    <w:p>
+      <w:pPr>
+        <w:spacing w:after="120"/>
+      </w:pPr>
+      <w:r>
+        <w:rPr>
           <w:b w:val="0"/>
           <w:color w:val="174A8B"/>
           <w:sz w:val="22"/>
         </w:rPr>
-        <w:t>Both subsets were executed in the historical exploratory study. The fixed support review considered 120 campaign, subset, target, and scenario curves. Only four meet the unchanged minimum of 32 common tuples across all positive lags. All four belong to the continuum subset with future continuum as target. The absence of a retained total subset curve under this design is a data support limitation, not a zero information result. Reporting a full physical comparison between the two subsets would overstate the available evidence.</w:t>
+        <w:t>Both sets are run for all four targets in all five seasons: 7200 decompositions, all with defined normalization and none dropped for support. In the total set the four way redundancy dominates at short lags because the total is the sum of the components. Mean leakage over lags and targets is 0.61 for the total set and 0.46 for the F5100 set (two bins).</w:t>
       </w:r>
     </w:p>
     <w:p>
@@ -2986,31 +2934,28 @@
     </w:p>
     <w:p>
       <w:pPr>
-        <w:keepNext/>
-        <w:spacing w:before="100" w:after="140" w:line="269" w:lineRule="auto"/>
-      </w:pPr>
-      <w:r>
-        <w:rPr>
-          <w:rFonts w:ascii="Calibri" w:hAnsi="Calibri"/>
+        <w:spacing w:after="120"/>
+      </w:pPr>
+      <w:r>
+        <w:rPr>
           <w:b/>
           <w:color w:val="945B00"/>
           <w:sz w:val="22"/>
         </w:rPr>
-        <w:t>Response Construction implemented but scientific analysis unperformed</w:t>
-      </w:r>
-    </w:p>
-    <w:p>
-      <w:pPr>
-        <w:spacing w:before="100" w:after="140" w:line="269" w:lineRule="auto"/>
-      </w:pPr>
-      <w:r>
-        <w:rPr>
-          <w:rFonts w:ascii="Calibri" w:hAnsi="Calibri"/>
+        <w:t>Response Completed with a declared interpretation; offsets need confirmation</w:t>
+      </w:r>
+    </w:p>
+    <w:p>
+      <w:pPr>
+        <w:spacing w:after="120"/>
+      </w:pPr>
+      <w:r>
+        <w:rPr>
           <w:b w:val="0"/>
           <w:color w:val="174A8B"/>
           <w:sz w:val="22"/>
         </w:rPr>
-        <w:t>Equation 3.18 expands the predictor vector with multiple shifted copies of variables. Assigning one different lag to each predictor is not the same construction. The expanded design is implemented and tested, and a support audit has run. Its expanded scientific decompositions and corresponding results figures have not run. The existing blue earlier and red earlier scenarios shift one predictor by a stipulated five days relative to the common base lag; they are sensitivity experiments, not measured delays and not a substitute for equation 3.18. Additional shifted copies would increase dimension and alter atom counts. This part remains incomplete and needs agreed shifts, adequate data, and an appropriate calibration plan.</w:t>
+        <w:t>Each predictor variable gets its own lag L plus an offset, so the four predictors still give 26 components. Blue leading samples the blue wing five days further back; red leading does the same for the red wing. Both are run for both sets, all targets and all seasons. A literal expansion with a second copy of every variable (equation 3.19 pattern) would have eight predictors and 502 components; it is implemented in lag_design.py but not used. The five day offset is our choice, of the size of the uncertainties of published H beta lags, and needs confirmation. Moving one wing back changes mean leakage by at most 0.08 but changes the component allocation by a median total variation of 0.30.</w:t>
       </w:r>
     </w:p>
     <w:p>
@@ -3093,31 +3038,28 @@
     </w:p>
     <w:p>
       <w:pPr>
-        <w:keepNext/>
-        <w:spacing w:before="100" w:after="140" w:line="269" w:lineRule="auto"/>
-      </w:pPr>
-      <w:r>
-        <w:rPr>
-          <w:rFonts w:ascii="Calibri" w:hAnsi="Calibri"/>
+        <w:spacing w:after="120"/>
+      </w:pPr>
+      <w:r>
+        <w:rPr>
           <w:b/>
-          <w:color w:val="945B00"/>
+          <w:color w:val="176B44"/>
           <w:sz w:val="22"/>
         </w:rPr>
-        <w:t>Response Figures supplied for retained computations</w:t>
-      </w:r>
-    </w:p>
-    <w:p>
-      <w:pPr>
-        <w:spacing w:before="100" w:after="140" w:line="269" w:lineRule="auto"/>
-      </w:pPr>
-      <w:r>
-        <w:rPr>
-          <w:rFonts w:ascii="Calibri" w:hAnsi="Calibri"/>
+        <w:t>Response Completed</w:t>
+      </w:r>
+    </w:p>
+    <w:p>
+      <w:pPr>
+        <w:spacing w:after="120"/>
+      </w:pPr>
+      <w:r>
+        <w:rPr>
           <w:b w:val="0"/>
           <w:color w:val="174A8B"/>
           <w:sz w:val="22"/>
         </w:rPr>
-        <w:t>Four component figures report the supported curves: 1992 common with 36 fixed dates, 1993 common with 90 dates, and 1993 blue earlier and red earlier with 78 dates each. Each curve uses identical target dates throughout its positive lag range. The dates are not forced to match across scenarios, so differences between scenarios can reflect support as well as offsets. Unsupported curves and unperformed expanded decompositions are not presented as completed figures. Table 1 documents coverage and Table 2 documents the retained comparisons.</w:t>
+        <w:t>There are 120 figures: 5 seasons, 2 sets, 4 targets and 3 lag configurations. They are in the results section and in the three atlas files collaborator_rebuild/epoch_results/figures/atlas_common.pdf, atlas_blue_leading.pdf and atlas_red_leading.pdf (one page per curve).</w:t>
       </w:r>
     </w:p>
     <w:p>
@@ -3155,31 +3097,28 @@
     </w:p>
     <w:p>
       <w:pPr>
-        <w:keepNext/>
-        <w:spacing w:before="100" w:after="140" w:line="269" w:lineRule="auto"/>
-      </w:pPr>
-      <w:r>
-        <w:rPr>
-          <w:rFonts w:ascii="Calibri" w:hAnsi="Calibri"/>
+        <w:spacing w:after="120"/>
+      </w:pPr>
+      <w:r>
+        <w:rPr>
           <w:b/>
-          <w:color w:val="945B00"/>
+          <w:color w:val="176B44"/>
           <w:sz w:val="22"/>
         </w:rPr>
-        <w:t>Response Campaign independence implemented</w:t>
-      </w:r>
-    </w:p>
-    <w:p>
-      <w:pPr>
-        <w:spacing w:before="100" w:after="140" w:line="269" w:lineRule="auto"/>
-      </w:pPr>
-      <w:r>
-        <w:rPr>
-          <w:rFonts w:ascii="Calibri" w:hAnsi="Calibri"/>
+        <w:t>Response Completed</w:t>
+      </w:r>
+    </w:p>
+    <w:p>
+      <w:pPr>
+        <w:spacing w:after="120"/>
+      </w:pPr>
+      <w:r>
+        <w:rPr>
           <w:b w:val="0"/>
           <w:color w:val="174A8B"/>
           <w:sz w:val="22"/>
         </w:rPr>
-        <w:t>Campaigns are analyzed independently rather than pooled into a single probability distribution. Quantile boundaries are derived from full native observations within each campaign and shared between the relevant comparisons. Fixed support is selected separately for each declared curve. Only 1992 and 1993 provide retained full curves under the present design. This does not establish that earlier campaigns lack coupling; it establishes that their observations do not support these complete scans under the chosen gap, lag range, and numerical guard.</w:t>
+        <w:t>Each season is analysed independently, with bin boundaries taken from its own native series. No season or target is dropped.</w:t>
       </w:r>
     </w:p>
     <w:p>
@@ -3271,60 +3210,145 @@
     </w:p>
     <w:p>
       <w:pPr>
-        <w:keepNext/>
-        <w:spacing w:before="100" w:after="140" w:line="269" w:lineRule="auto"/>
-      </w:pPr>
-      <w:r>
-        <w:rPr>
-          <w:rFonts w:ascii="Calibri" w:hAnsi="Calibri"/>
+        <w:spacing w:after="120"/>
+      </w:pPr>
+      <w:r>
+        <w:rPr>
           <w:b/>
           <w:color w:val="945B00"/>
           <w:sz w:val="22"/>
         </w:rPr>
-        <w:t>Response Descriptive findings supplied and physical conclusions withheld</w:t>
-      </w:r>
-    </w:p>
-    <w:p>
-      <w:pPr>
-        <w:spacing w:before="100" w:after="140" w:line="269" w:lineRule="auto"/>
-      </w:pPr>
-      <w:r>
-        <w:rPr>
-          <w:rFonts w:ascii="Calibri" w:hAnsi="Calibri"/>
+        <w:t>Response Interpretation supplied; astrophysical review pending</w:t>
+      </w:r>
+    </w:p>
+    <w:p>
+      <w:pPr>
+        <w:spacing w:after="120"/>
+      </w:pPr>
+      <w:r>
+        <w:rPr>
           <w:b w:val="0"/>
           <w:color w:val="174A8B"/>
           <w:sz w:val="22"/>
         </w:rPr>
-        <w:t>The individual extrema and their lags are reported, including the representative 1993 common curve. Its largest unique term changes from continuum history at six days with two bins to one day with three bins. The leading redundancy and synergy components also change. Median total variation between bin settings ranges from 0.523 to 0.610 across the four retained curves. Thus a large normalized term, a low leak, or a local maximum does not identify a stable physical delay. Leakage is residual uncertainty under the model, not a unique diagnosis of an omitted driver.</w:t>
-      </w:r>
-    </w:p>
-    <w:p>
-      <w:pPr>
-        <w:spacing w:before="100" w:after="140" w:line="269" w:lineRule="auto"/>
-      </w:pPr>
-      <w:r>
-        <w:rPr>
-          <w:rFonts w:ascii="Calibri" w:hAnsi="Calibri"/>
+        <w:t>Leakage is lowest at the shortest lag in 36 of 40 curves (self history) and highest at 20 days or longer in 35 of 40. At the leakage maximum the largest component is a synergy or the unique continuum term; at the minimum it is the four way redundancy (total set) or a unique term (F5100 set). In the F5100 set the unique continuum component of the line targets peaks at 16 to 29 days in 13 of 15 curves, longer than the published 11 to 20 days by a median of 6 days. The red wing peaks before the blue wing in 1989, 1991, 1992 and 1993 and after it in 1990: red leading blue in four of five seasons, the pattern Xi et al. report for 2019 and 2021 and attribute to infall. The differences are five to seven days, one grid step per day and without uncertainty, and the result changes with the bin count in 1990. Mean leakage across seasons follows the tuple count, as the benchmark predicts, so it is not a physical comparison. No significance level or flux uncertainty propagation has been computed.</w:t>
+      </w:r>
+    </w:p>
+    <w:p>
+      <w:pPr>
+        <w:spacing w:after="120"/>
+      </w:pPr>
+      <w:r>
+        <w:rPr>
+          <w:b/>
+          <w:color w:val="945B00"/>
+          <w:sz w:val="22"/>
+        </w:rPr>
+        <w:t>Response Open items</w:t>
+      </w:r>
+    </w:p>
+    <w:p>
+      <w:pPr>
+        <w:spacing w:after="120"/>
+      </w:pPr>
+      <w:r>
+        <w:rPr>
           <w:b w:val="0"/>
           <w:color w:val="174A8B"/>
           <w:sz w:val="22"/>
         </w:rPr>
-        <w:t>Initial calibration comprises eight exact categorical laws and 6400 sampled decompositions. Independent variables yield substantial apparent information at the observed sample sizes, especially with three states. These artificial controls omit temporal dependence, interpolation, fitted boundaries, flux errors, and weak physical signals; they do not provide an AGN significance threshold. The ordering audit checks all 24 predictor permutations over 240 configurations, for 5760 evaluations. Eleven configurations change allocation above the declared numerical tolerance, with maximum total variation 0.188. Total information and leakage remain invariant to numerical precision. The 1993 common curves are stable to ordering but still strongly sensitive to bins, so ordering cannot solely explain that sensitivity.</w:t>
-      </w:r>
-    </w:p>
-    <w:p>
-      <w:pPr>
-        <w:spacing w:before="100" w:after="140" w:line="269" w:lineRule="auto"/>
-      </w:pPr>
-      <w:r>
-        <w:rPr>
-          <w:rFonts w:ascii="Calibri" w:hAnsi="Calibri"/>
-          <w:b w:val="0"/>
-          <w:color w:val="174A8B"/>
-          <w:sz w:val="22"/>
-        </w:rPr>
-        <w:t>The section therefore reports a methodological limitation rather than an interesting positive astrophysical detection. Realistic observation calibration, flux uncertainty propagation, and significance across the fixed support lag scans remain unperformed. The total and three component line fluxes also nearly sum and share the same spectra, so they are not independent physical regions. The comparison with Lu and Xi remains contextual. Collaborator review should precede any further interpretation or new scientific runs.</w:t>
-      </w:r>
+        <w:t>1. Confirm the lag range (1 to 30 days) and the five day offsets for the uncommon lags. 2. Ayan reads Xi et al. 2025 and Lu et al. 2022 and checks the astrophysical wording. 3. Decide whether a significance test and flux uncertainty propagation should be added. 4. Decide whether the literal equation 3.18 expansion with extra copies of each variable is wanted.</w:t>
+      </w:r>
+    </w:p>
+    <w:p>
+      <w:pPr>
+        <w:ind w:left="360"/>
+        <w:rPr>
+          <w:rFonts w:ascii="Times New Roman" w:hAnsi="Times New Roman" w:cs="Times New Roman"/>
+          <w:sz w:val="24"/>
+          <w:szCs w:val="24"/>
+          <w:lang w:val="en-US"/>
+        </w:rPr>
+      </w:pPr>
+    </w:p>
+    <w:p>
+      <w:pPr>
+        <w:pStyle w:val="ListParagraph"/>
+        <w:rPr>
+          <w:rFonts w:ascii="Times New Roman" w:hAnsi="Times New Roman" w:cs="Times New Roman"/>
+          <w:sz w:val="24"/>
+          <w:szCs w:val="24"/>
+          <w:lang w:val="en-US"/>
+        </w:rPr>
+      </w:pPr>
+    </w:p>
+    <w:p>
+      <w:pPr>
+        <w:pStyle w:val="ListParagraph"/>
+        <w:rPr>
+          <w:rFonts w:ascii="Times New Roman" w:hAnsi="Times New Roman" w:cs="Times New Roman"/>
+          <w:sz w:val="24"/>
+          <w:szCs w:val="24"/>
+          <w:lang w:val="en-US"/>
+        </w:rPr>
+      </w:pPr>
+    </w:p>
+    <w:p>
+      <w:pPr>
+        <w:ind w:left="360"/>
+        <w:rPr>
+          <w:rFonts w:ascii="Times New Roman" w:hAnsi="Times New Roman" w:cs="Times New Roman"/>
+          <w:sz w:val="24"/>
+          <w:szCs w:val="24"/>
+          <w:lang w:val="en-US"/>
+        </w:rPr>
+      </w:pPr>
+    </w:p>
+    <w:p>
+      <w:pPr>
+        <w:ind w:left="360"/>
+        <w:rPr>
+          <w:rFonts w:ascii="Times New Roman" w:hAnsi="Times New Roman" w:cs="Times New Roman"/>
+          <w:sz w:val="24"/>
+          <w:szCs w:val="24"/>
+          <w:lang w:val="en-US"/>
+        </w:rPr>
+      </w:pPr>
+    </w:p>
+    <w:p>
+      <w:pPr>
+        <w:ind w:left="360"/>
+        <w:rPr>
+          <w:rFonts w:ascii="Times New Roman" w:hAnsi="Times New Roman" w:cs="Times New Roman"/>
+          <w:sz w:val="24"/>
+          <w:szCs w:val="24"/>
+          <w:lang w:val="en-US"/>
+        </w:rPr>
+      </w:pPr>
+    </w:p>
+    <w:p>
+      <w:pPr>
+        <w:ind w:left="360"/>
+        <w:rPr>
+          <w:rFonts w:ascii="Times New Roman" w:hAnsi="Times New Roman" w:cs="Times New Roman"/>
+          <w:color w:val="EE0000"/>
+          <w:sz w:val="24"/>
+          <w:szCs w:val="24"/>
+          <w:lang w:val="en-US"/>
+        </w:rPr>
+      </w:pPr>
+    </w:p>
+    <w:p>
+      <w:pPr>
+        <w:ind w:left="360"/>
+        <w:rPr>
+          <w:rFonts w:ascii="Times New Roman" w:hAnsi="Times New Roman" w:cs="Times New Roman"/>
+          <w:color w:val="EE0000"/>
+          <w:sz w:val="24"/>
+          <w:szCs w:val="24"/>
+          <w:lang w:val="en-US"/>
+        </w:rPr>
+      </w:pPr>
     </w:p>
     <w:sectPr>
       <w:pgSz w:w="11906" w:h="16838"/>

</xml_diff>

<commit_message>
Shorten the paper to 12 pages: four example figures, all 120 in the atlas PDFs
Co-Authored-By: Claude Sonnet 5.5 <noreply@anthropic.com>
</commit_message>
<xml_diff>
--- a/output/docx/SURD_September_Instructions_With_Replies.docx
+++ b/output/docx/SURD_September_Instructions_With_Replies.docx
@@ -602,7 +602,7 @@
           <w:color w:val="174A8B"/>
           <w:sz w:val="22"/>
         </w:rPr>
-        <w:t>The deliverable is the LaTeX section collaborator_rebuild/results_section/results_section.tex, not a paper. It contains eight tables, seven pages of text and 120 figures. The compiled review copy is output/pdf/surd_epoch_results.pdf (131 pages). It has not been inserted into main.tex.</w:t>
+        <w:t>The deliverable is the LaTeX section collaborator_rebuild/results_section/results_section.tex, not a paper. It contains eight tables and four example figures; all 120 figures are in three atlas PDFs. The compiled review copy is output/pdf/surd_epoch_results.pdf (12 pages). It has not been inserted into main.tex.</w:t>
       </w:r>
     </w:p>
     <w:p>
@@ -3059,7 +3059,7 @@
           <w:color w:val="174A8B"/>
           <w:sz w:val="22"/>
         </w:rPr>
-        <w:t>There are 120 figures: 5 seasons, 2 sets, 4 targets and 3 lag configurations. They are in the results section and in the three atlas files collaborator_rebuild/epoch_results/figures/atlas_common.pdf, atlas_blue_leading.pdf and atlas_red_leading.pdf (one page per curve).</w:t>
+        <w:t>There are 120 figures: 5 seasons, 2 sets, 4 targets and 3 lag configurations. Four examples are in the results section; all 120 are in the three atlas files collaborator_rebuild/epoch_results/figures/atlas_common.pdf, atlas_blue_leading.pdf and atlas_red_leading.pdf (one page per curve).</w:t>
       </w:r>
     </w:p>
     <w:p>

</xml_diff>

<commit_message>
Replies: state sampling, lag and binning assumptions explicitly and map tables and figures to the subsets
Co-Authored-By: Claude Sonnet 5.5 <noreply@anthropic.com>
</commit_message>
<xml_diff>
--- a/output/docx/SURD_September_Instructions_With_Replies.docx
+++ b/output/docx/SURD_September_Instructions_With_Replies.docx
@@ -430,7 +430,7 @@
           <w:color w:val="174A8B"/>
           <w:sz w:val="22"/>
         </w:rPr>
-        <w:t>Each season has its own five series. Native dates: 1989, 124 continuum and 48 spectra; 1990, 94 and 38; 1991, 65 and 32; 1992, 83 and 46; 1993, 191 and 60. For the analysis each series is placed on a daily grid within its season (linear interpolation, no extrapolation, no gap above 15 days bridged), which gives between 118 and 261 tuples at every lag of every curve.</w:t>
+        <w:t>Each season has its own five series. Native dates: 1989, 124 continuum and 48 spectra; 1990, 94 and 38; 1991, 65 and 32; 1992, 83 and 46; 1993, 191 and 60. Explicit sampling assumption: the spectra are 3 to 7 days apart in the median, too sparse for a five dimensional histogram at 30 lags on native dates. Within each season independently, every series is therefore linearly interpolated onto a daily grid between its observed endpoints, without extrapolation and without bridging gaps longer than 15 days. This gives 133 to 261 five variable tuples per lag for common lags (118 at the smallest for the uncommon lags). The tuples are interpolated and autocorrelated, so they are not independent samples.</w:t>
       </w:r>
     </w:p>
     <w:p>
@@ -1821,7 +1821,7 @@
           <w:color w:val="174A8B"/>
           <w:sz w:val="22"/>
         </w:rPr>
-        <w:t>The specific mutual information components and the leakage are computed and normalized as in Figure 4.1. The lag placeholders are not filled in the instructions. We use base lags of 1 to 30 days in one day steps for both sets, which covers the 20 to 30 day seasonal ranges proposed for the modern seasons. Histograms use two bins (primary) and three bins (sensitivity). Please confirm or replace the lag range.</w:t>
+        <w:t>The specific mutual information components and the leakage are computed and normalized as in Figure 4.1: every unique, redundant and synergistic component is divided by the joint mutual information between the future target and the four predictors, so the 26 components sum to one, and leakage is divided by the target entropy. The two subsets are {total, blue, core, red} and {F5100, blue, core, red}. The lag placeholders are not filled in the instructions, so these are our assumptions: base lags of 1 to 30 days in one day steps for both subsets, which covers the 20 to 30 day seasonal ranges proposed for the modern seasons and the published historical H beta lags of 11 to 20 days. Histograms use two bins (2^5 = 32 cells, primary) and three bins (3^5 = 243 cells, sensitivity), with quantile boundaries taken from each season’s own native series. With 133 to 261 tuples the three bin histograms are sparse. Please confirm or replace the lag range.</w:t>
       </w:r>
     </w:p>
     <w:p>
@@ -2768,7 +2768,7 @@
           <w:color w:val="174A8B"/>
           <w:sz w:val="22"/>
         </w:rPr>
-        <w:t>Both sets are run for all four targets in all five seasons: 7200 decompositions, all with defined normalization and none dropped for support. In the total set the four way redundancy dominates at short lags because the total is the sum of the components. Mean leakage over lags and targets is 0.61 for the total set and 0.46 for the F5100 set (two bins).</w:t>
+        <w:t>Both sets are run for all four targets in all five seasons: 7200 decompositions, all with defined normalization and none dropped for support. Table 2 of the paper summarizes the 20 curves (5 seasons, 4 targets) of the total set and Table 3 the 20 curves of the F5100 set. Figure 3 is an example of the total set; Figures 1, 2 and 4 are examples of the F5100 set. All 40 common lag curves are in atlas_common.pdf. In the total set the four way redundancy dominates at short lags because the total is the sum of the components. Mean leakage over lags and targets is 0.61 for the total set and 0.46 for the F5100 set (two bins).</w:t>
       </w:r>
     </w:p>
     <w:p>

</xml_diff>